<commit_message>
docs: actualizacion de la IEEE (ERS_SIGTRH_v1.2) y diagrama de clases en la fase 4
</commit_message>
<xml_diff>
--- a/Fase 3 Base De Datos Y Modelado TalentSoft/Talentsoft - MER.docx
+++ b/Fase 3 Base De Datos Y Modelado TalentSoft/Talentsoft - MER.docx
@@ -3298,19 +3298,32 @@
       </w:pPr>
       <w:r>
         <w:rPr>
+          <w:rtl w:val="0"/>
+        </w:rPr>
+      </w:r>
+    </w:p>
+    <w:p>
+      <w:pPr>
+        <w:rPr>
+          <w:sz w:val="24"/>
+          <w:szCs w:val="24"/>
+        </w:rPr>
+      </w:pPr>
+      <w:r>
+        <w:rPr>
           <w:sz w:val="24"/>
           <w:szCs w:val="24"/>
         </w:rPr>
         <w:drawing>
           <wp:inline distB="114300" distT="114300" distL="114300" distR="114300">
-            <wp:extent cx="5731200" cy="5092700"/>
+            <wp:extent cx="5731200" cy="7353300"/>
             <wp:effectExtent b="0" l="0" r="0" t="0"/>
-            <wp:docPr id="1" name="image2.png"/>
+            <wp:docPr id="1" name="image2.jpg"/>
             <a:graphic>
               <a:graphicData uri="http://schemas.openxmlformats.org/drawingml/2006/picture">
                 <pic:pic>
                   <pic:nvPicPr>
-                    <pic:cNvPr id="0" name="image2.png"/>
+                    <pic:cNvPr id="0" name="image2.jpg"/>
                     <pic:cNvPicPr preferRelativeResize="0"/>
                   </pic:nvPicPr>
                   <pic:blipFill>
@@ -3323,7 +3336,7 @@
                   <pic:spPr>
                     <a:xfrm>
                       <a:off x="0" y="0"/>
-                      <a:ext cx="5731200" cy="5092700"/>
+                      <a:ext cx="5731200" cy="7353300"/>
                     </a:xfrm>
                     <a:prstGeom prst="rect"/>
                     <a:ln/>
@@ -3362,19 +3375,6 @@
       </w:pPr>
       <w:r>
         <w:rPr>
-          <w:rtl w:val="0"/>
-        </w:rPr>
-      </w:r>
-    </w:p>
-    <w:p>
-      <w:pPr>
-        <w:rPr>
-          <w:sz w:val="24"/>
-          <w:szCs w:val="24"/>
-        </w:rPr>
-      </w:pPr>
-      <w:r>
-        <w:rPr>
           <w:b w:val="1"/>
           <w:bCs w:val="1"/>
           <w:sz w:val="24"/>
@@ -3383,25 +3383,13 @@
         </w:rPr>
         <w:t xml:space="preserve">Link diagrama: </w:t>
       </w:r>
-      <w:hyperlink r:id="rId7">
-        <w:r>
-          <w:rPr>
-            <w:color w:val="1155cc"/>
-            <w:sz w:val="24"/>
-            <w:szCs w:val="24"/>
-            <w:u w:val="single"/>
-            <w:rtl w:val="0"/>
-          </w:rPr>
-          <w:t xml:space="preserve">https://app.diagrams.net/#G1vq5smE2MJcKiZFnzYty03kBqI7yCe63u#%7B%22pageId%22%3A%2286MRLsuoaQikn4jHhPrv%22%7D</w:t>
-        </w:r>
-      </w:hyperlink>
-      <w:r>
-        <w:rPr>
-          <w:sz w:val="24"/>
-          <w:szCs w:val="24"/>
-          <w:rtl w:val="0"/>
-        </w:rPr>
-        <w:t xml:space="preserve"> </w:t>
+      <w:r>
+        <w:rPr>
+          <w:sz w:val="24"/>
+          <w:szCs w:val="24"/>
+          <w:rtl w:val="0"/>
+        </w:rPr>
+        <w:t xml:space="preserve">https://drive.google.com/file/d/1r-1lvLrBqJbLMuLqiLVGTTuXR2ZC4Sd4/view?usp=sharing</w:t>
       </w:r>
     </w:p>
     <w:p>
@@ -7512,7 +7500,7 @@
                     <pic:cNvPicPr preferRelativeResize="0"/>
                   </pic:nvPicPr>
                   <pic:blipFill>
-                    <a:blip r:embed="rId8"/>
+                    <a:blip r:embed="rId7"/>
                     <a:srcRect b="0" l="0" r="0" t="0"/>
                     <a:stretch>
                       <a:fillRect/>

</xml_diff>